<commit_message>
chore: import research literature and organize Week 7 homework draft materials
</commit_message>
<xml_diff>
--- a/_data/NTUST/homework/Week7 團體作業2_King.docx
+++ b/_data/NTUST/homework/Week7 團體作業2_King.docx
@@ -813,18 +813,7 @@
                                 <w:sz w:val="28"/>
                                 <w:szCs w:val="28"/>
                               </w:rPr>
-                              <w:t>TBC</w:t>
-                            </w:r>
-                            <w:r>
-                              <w:rPr>
-                                <w:rFonts w:ascii="標楷體" w:eastAsia="標楷體" w:hAnsi="標楷體"/>
-                                <w:b/>
-                                <w:bCs/>
-                                <w:color w:val="0070C0"/>
-                                <w:sz w:val="28"/>
-                                <w:szCs w:val="28"/>
-                              </w:rPr>
-                              <w:t>？</w:t>
+                              <w:t>歐德商用B2B如何透過產品服務化影響組織採購及其意願降低單一營收的風險?</w:t>
                             </w:r>
                           </w:p>
                           <w:p>
@@ -874,20 +863,7 @@
                           <w:sz w:val="28"/>
                           <w:szCs w:val="28"/>
                         </w:rPr>
-                        <w:t>TBC</w:t>
-                      </w:r>
-                      <w:bookmarkStart w:id="1" w:name="_GoBack"/>
-                      <w:bookmarkEnd w:id="1"/>
-                      <w:r>
-                        <w:rPr>
-                          <w:rFonts w:ascii="標楷體" w:eastAsia="標楷體" w:hAnsi="標楷體"/>
-                          <w:b/>
-                          <w:bCs/>
-                          <w:color w:val="0070C0"/>
-                          <w:sz w:val="28"/>
-                          <w:szCs w:val="28"/>
-                        </w:rPr>
-                        <w:t>？</w:t>
+                        <w:t>歐德商用B2B如何透過產品服務化影響組織採購及其意願降低單一營收的風險?</w:t>
                       </w:r>
                     </w:p>
                     <w:p>
@@ -1353,7 +1329,7 @@
               </wp:anchor>
             </w:drawing>
           </mc:Choice>
-          <mc:Fallback xmlns:cx="http://schemas.microsoft.com/office/drawing/2014/chartex" xmlns:cx1="http://schemas.microsoft.com/office/drawing/2015/9/8/chartex" xmlns:cx2="http://schemas.microsoft.com/office/drawing/2015/10/21/chartex" xmlns:cx3="http://schemas.microsoft.com/office/drawing/2016/5/9/chartex" xmlns:cx4="http://schemas.microsoft.com/office/drawing/2016/5/10/chartex" xmlns:cx5="http://schemas.microsoft.com/office/drawing/2016/5/11/chartex" xmlns:cx6="http://schemas.microsoft.com/office/drawing/2016/5/12/chartex" xmlns:cx7="http://schemas.microsoft.com/office/drawing/2016/5/13/chartex" xmlns:cx8="http://schemas.microsoft.com/office/drawing/2016/5/14/chartex" xmlns:aink="http://schemas.microsoft.com/office/drawing/2016/ink" xmlns:am3d="http://schemas.microsoft.com/office/drawing/2017/model3d" xmlns:w15="http://schemas.microsoft.com/office/word/2012/wordml" xmlns:w16cex="http://schemas.microsoft.com/office/word/2018/wordml/cex" xmlns:w16cid="http://schemas.microsoft.com/office/word/2016/wordml/cid" xmlns:w16="http://schemas.microsoft.com/office/word/2018/wordml" xmlns:w16sdtdh="http://schemas.microsoft.com/office/word/2020/wordml/sdtdatahash" xmlns:w16se="http://schemas.microsoft.com/office/word/2015/wordml/symex">
+          <mc:Fallback xmlns:w16se="http://schemas.microsoft.com/office/word/2015/wordml/symex" xmlns:w16sdtdh="http://schemas.microsoft.com/office/word/2020/wordml/sdtdatahash" xmlns:w16="http://schemas.microsoft.com/office/word/2018/wordml" xmlns:w16cid="http://schemas.microsoft.com/office/word/2016/wordml/cid" xmlns:w16cex="http://schemas.microsoft.com/office/word/2018/wordml/cex" xmlns:w15="http://schemas.microsoft.com/office/word/2012/wordml" xmlns:am3d="http://schemas.microsoft.com/office/drawing/2017/model3d" xmlns:aink="http://schemas.microsoft.com/office/drawing/2016/ink" xmlns:cx8="http://schemas.microsoft.com/office/drawing/2016/5/14/chartex" xmlns:cx7="http://schemas.microsoft.com/office/drawing/2016/5/13/chartex" xmlns:cx6="http://schemas.microsoft.com/office/drawing/2016/5/12/chartex" xmlns:cx5="http://schemas.microsoft.com/office/drawing/2016/5/11/chartex" xmlns:cx4="http://schemas.microsoft.com/office/drawing/2016/5/10/chartex" xmlns:cx3="http://schemas.microsoft.com/office/drawing/2016/5/9/chartex" xmlns:cx2="http://schemas.microsoft.com/office/drawing/2015/10/21/chartex" xmlns:cx1="http://schemas.microsoft.com/office/drawing/2015/9/8/chartex" xmlns:cx="http://schemas.microsoft.com/office/drawing/2014/chartex">
             <w:pict>
               <v:rect w14:anchorId="1FD10C14" id="矩形 6" o:spid="_x0000_s1026" style="position:absolute;margin-left:2.45pt;margin-top:95.05pt;width:312.65pt;height:231.2pt;z-index:251669504;visibility:visible;mso-wrap-style:square;mso-width-percent:0;mso-height-percent:0;mso-wrap-distance-left:9pt;mso-wrap-distance-top:0;mso-wrap-distance-right:9pt;mso-wrap-distance-bottom:0;mso-position-horizontal:absolute;mso-position-horizontal-relative:text;mso-position-vertical:absolute;mso-position-vertical-relative:text;mso-width-percent:0;mso-height-percent:0;mso-width-relative:margin;mso-height-relative:margin;v-text-anchor:middle" o:gfxdata="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" filled="f" strokecolor="#fc6" strokeweight="6.5pt"/>
             </w:pict>
@@ -2147,7 +2123,7 @@
               </wp:anchor>
             </w:drawing>
           </mc:Choice>
-          <mc:Fallback xmlns:cx="http://schemas.microsoft.com/office/drawing/2014/chartex" xmlns:cx1="http://schemas.microsoft.com/office/drawing/2015/9/8/chartex" xmlns:cx2="http://schemas.microsoft.com/office/drawing/2015/10/21/chartex" xmlns:cx3="http://schemas.microsoft.com/office/drawing/2016/5/9/chartex" xmlns:cx4="http://schemas.microsoft.com/office/drawing/2016/5/10/chartex" xmlns:cx5="http://schemas.microsoft.com/office/drawing/2016/5/11/chartex" xmlns:cx6="http://schemas.microsoft.com/office/drawing/2016/5/12/chartex" xmlns:cx7="http://schemas.microsoft.com/office/drawing/2016/5/13/chartex" xmlns:cx8="http://schemas.microsoft.com/office/drawing/2016/5/14/chartex" xmlns:aink="http://schemas.microsoft.com/office/drawing/2016/ink" xmlns:am3d="http://schemas.microsoft.com/office/drawing/2017/model3d" xmlns:w15="http://schemas.microsoft.com/office/word/2012/wordml" xmlns:w16cex="http://schemas.microsoft.com/office/word/2018/wordml/cex" xmlns:w16cid="http://schemas.microsoft.com/office/word/2016/wordml/cid" xmlns:w16="http://schemas.microsoft.com/office/word/2018/wordml" xmlns:w16sdtdh="http://schemas.microsoft.com/office/word/2020/wordml/sdtdatahash" xmlns:w16se="http://schemas.microsoft.com/office/word/2015/wordml/symex">
+          <mc:Fallback xmlns:w16se="http://schemas.microsoft.com/office/word/2015/wordml/symex" xmlns:w16sdtdh="http://schemas.microsoft.com/office/word/2020/wordml/sdtdatahash" xmlns:w16="http://schemas.microsoft.com/office/word/2018/wordml" xmlns:w16cid="http://schemas.microsoft.com/office/word/2016/wordml/cid" xmlns:w16cex="http://schemas.microsoft.com/office/word/2018/wordml/cex" xmlns:w15="http://schemas.microsoft.com/office/word/2012/wordml" xmlns:am3d="http://schemas.microsoft.com/office/drawing/2017/model3d" xmlns:aink="http://schemas.microsoft.com/office/drawing/2016/ink" xmlns:cx8="http://schemas.microsoft.com/office/drawing/2016/5/14/chartex" xmlns:cx7="http://schemas.microsoft.com/office/drawing/2016/5/13/chartex" xmlns:cx6="http://schemas.microsoft.com/office/drawing/2016/5/12/chartex" xmlns:cx5="http://schemas.microsoft.com/office/drawing/2016/5/11/chartex" xmlns:cx4="http://schemas.microsoft.com/office/drawing/2016/5/10/chartex" xmlns:cx3="http://schemas.microsoft.com/office/drawing/2016/5/9/chartex" xmlns:cx2="http://schemas.microsoft.com/office/drawing/2015/10/21/chartex" xmlns:cx1="http://schemas.microsoft.com/office/drawing/2015/9/8/chartex" xmlns:cx="http://schemas.microsoft.com/office/drawing/2014/chartex">
             <w:pict>
               <v:shapetype w14:anchorId="4A12DED1" id="_x0000_t5" coordsize="21600,21600" o:spt="5" adj="10800" path="m@0,l,21600r21600,xe">
                 <v:stroke joinstyle="miter"/>
@@ -2231,7 +2207,7 @@
               </wp:anchor>
             </w:drawing>
           </mc:Choice>
-          <mc:Fallback xmlns:cx="http://schemas.microsoft.com/office/drawing/2014/chartex" xmlns:cx1="http://schemas.microsoft.com/office/drawing/2015/9/8/chartex" xmlns:cx2="http://schemas.microsoft.com/office/drawing/2015/10/21/chartex" xmlns:cx3="http://schemas.microsoft.com/office/drawing/2016/5/9/chartex" xmlns:cx4="http://schemas.microsoft.com/office/drawing/2016/5/10/chartex" xmlns:cx5="http://schemas.microsoft.com/office/drawing/2016/5/11/chartex" xmlns:cx6="http://schemas.microsoft.com/office/drawing/2016/5/12/chartex" xmlns:cx7="http://schemas.microsoft.com/office/drawing/2016/5/13/chartex" xmlns:cx8="http://schemas.microsoft.com/office/drawing/2016/5/14/chartex" xmlns:aink="http://schemas.microsoft.com/office/drawing/2016/ink" xmlns:am3d="http://schemas.microsoft.com/office/drawing/2017/model3d" xmlns:w15="http://schemas.microsoft.com/office/word/2012/wordml" xmlns:w16cex="http://schemas.microsoft.com/office/word/2018/wordml/cex" xmlns:w16cid="http://schemas.microsoft.com/office/word/2016/wordml/cid" xmlns:w16="http://schemas.microsoft.com/office/word/2018/wordml" xmlns:w16sdtdh="http://schemas.microsoft.com/office/word/2020/wordml/sdtdatahash" xmlns:w16se="http://schemas.microsoft.com/office/word/2015/wordml/symex">
+          <mc:Fallback xmlns:w16se="http://schemas.microsoft.com/office/word/2015/wordml/symex" xmlns:w16sdtdh="http://schemas.microsoft.com/office/word/2020/wordml/sdtdatahash" xmlns:w16="http://schemas.microsoft.com/office/word/2018/wordml" xmlns:w16cid="http://schemas.microsoft.com/office/word/2016/wordml/cid" xmlns:w16cex="http://schemas.microsoft.com/office/word/2018/wordml/cex" xmlns:w15="http://schemas.microsoft.com/office/word/2012/wordml" xmlns:am3d="http://schemas.microsoft.com/office/drawing/2017/model3d" xmlns:aink="http://schemas.microsoft.com/office/drawing/2016/ink" xmlns:cx8="http://schemas.microsoft.com/office/drawing/2016/5/14/chartex" xmlns:cx7="http://schemas.microsoft.com/office/drawing/2016/5/13/chartex" xmlns:cx6="http://schemas.microsoft.com/office/drawing/2016/5/12/chartex" xmlns:cx5="http://schemas.microsoft.com/office/drawing/2016/5/11/chartex" xmlns:cx4="http://schemas.microsoft.com/office/drawing/2016/5/10/chartex" xmlns:cx3="http://schemas.microsoft.com/office/drawing/2016/5/9/chartex" xmlns:cx2="http://schemas.microsoft.com/office/drawing/2015/10/21/chartex" xmlns:cx1="http://schemas.microsoft.com/office/drawing/2015/9/8/chartex" xmlns:cx="http://schemas.microsoft.com/office/drawing/2014/chartex">
             <w:pict>
               <v:line w14:anchorId="6455DD4A" id="直線接點 1" o:spid="_x0000_s1026" style="position:absolute;z-index:251660288;visibility:visible;mso-wrap-style:square;mso-width-percent:0;mso-wrap-distance-left:9pt;mso-wrap-distance-top:0;mso-wrap-distance-right:9pt;mso-wrap-distance-bottom:0;mso-position-horizontal:absolute;mso-position-horizontal-relative:text;mso-position-vertical:absolute;mso-position-vertical-relative:text;mso-width-percent:0;mso-width-relative:margin" from="-29pt,171.95pt" to="691pt,172.55pt" o:gfxdata="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" strokecolor="black [3200]" strokeweight="1pt">
                 <v:stroke dashstyle="1 1" joinstyle="miter"/>
@@ -2303,7 +2279,7 @@
               </wp:anchor>
             </w:drawing>
           </mc:Choice>
-          <mc:Fallback xmlns:cx="http://schemas.microsoft.com/office/drawing/2014/chartex" xmlns:cx1="http://schemas.microsoft.com/office/drawing/2015/9/8/chartex" xmlns:cx2="http://schemas.microsoft.com/office/drawing/2015/10/21/chartex" xmlns:cx3="http://schemas.microsoft.com/office/drawing/2016/5/9/chartex" xmlns:cx4="http://schemas.microsoft.com/office/drawing/2016/5/10/chartex" xmlns:cx5="http://schemas.microsoft.com/office/drawing/2016/5/11/chartex" xmlns:cx6="http://schemas.microsoft.com/office/drawing/2016/5/12/chartex" xmlns:cx7="http://schemas.microsoft.com/office/drawing/2016/5/13/chartex" xmlns:cx8="http://schemas.microsoft.com/office/drawing/2016/5/14/chartex" xmlns:aink="http://schemas.microsoft.com/office/drawing/2016/ink" xmlns:am3d="http://schemas.microsoft.com/office/drawing/2017/model3d" xmlns:w15="http://schemas.microsoft.com/office/word/2012/wordml" xmlns:w16cex="http://schemas.microsoft.com/office/word/2018/wordml/cex" xmlns:w16cid="http://schemas.microsoft.com/office/word/2016/wordml/cid" xmlns:w16="http://schemas.microsoft.com/office/word/2018/wordml" xmlns:w16sdtdh="http://schemas.microsoft.com/office/word/2020/wordml/sdtdatahash" xmlns:w16se="http://schemas.microsoft.com/office/word/2015/wordml/symex">
+          <mc:Fallback xmlns:w16se="http://schemas.microsoft.com/office/word/2015/wordml/symex" xmlns:w16sdtdh="http://schemas.microsoft.com/office/word/2020/wordml/sdtdatahash" xmlns:w16="http://schemas.microsoft.com/office/word/2018/wordml" xmlns:w16cid="http://schemas.microsoft.com/office/word/2016/wordml/cid" xmlns:w16cex="http://schemas.microsoft.com/office/word/2018/wordml/cex" xmlns:w15="http://schemas.microsoft.com/office/word/2012/wordml" xmlns:am3d="http://schemas.microsoft.com/office/drawing/2017/model3d" xmlns:aink="http://schemas.microsoft.com/office/drawing/2016/ink" xmlns:cx8="http://schemas.microsoft.com/office/drawing/2016/5/14/chartex" xmlns:cx7="http://schemas.microsoft.com/office/drawing/2016/5/13/chartex" xmlns:cx6="http://schemas.microsoft.com/office/drawing/2016/5/12/chartex" xmlns:cx5="http://schemas.microsoft.com/office/drawing/2016/5/11/chartex" xmlns:cx4="http://schemas.microsoft.com/office/drawing/2016/5/10/chartex" xmlns:cx3="http://schemas.microsoft.com/office/drawing/2016/5/9/chartex" xmlns:cx2="http://schemas.microsoft.com/office/drawing/2015/10/21/chartex" xmlns:cx1="http://schemas.microsoft.com/office/drawing/2015/9/8/chartex" xmlns:cx="http://schemas.microsoft.com/office/drawing/2014/chartex">
             <w:pict>
               <v:line w14:anchorId="063E383B" id="直線接點 1" o:spid="_x0000_s1026" style="position:absolute;z-index:251667456;visibility:visible;mso-wrap-style:square;mso-width-percent:0;mso-wrap-distance-left:9pt;mso-wrap-distance-top:0;mso-wrap-distance-right:9pt;mso-wrap-distance-bottom:0;mso-position-horizontal:absolute;mso-position-horizontal-relative:text;mso-position-vertical:absolute;mso-position-vertical-relative:text;mso-width-percent:0;mso-width-relative:margin" from="-29pt,96.4pt" to="691pt,97pt" o:gfxdata="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" strokecolor="black [3200]" strokeweight="1pt">
                 <v:stroke dashstyle="1 1" joinstyle="miter"/>
@@ -2481,11 +2457,11 @@
         <w:tblLook w:val="04A0" w:firstRow="1" w:lastRow="0" w:firstColumn="1" w:lastColumn="0" w:noHBand="0" w:noVBand="1"/>
       </w:tblPr>
       <w:tblGrid>
-        <w:gridCol w:w="2122"/>
-        <w:gridCol w:w="2790"/>
-        <w:gridCol w:w="3773"/>
-        <w:gridCol w:w="2801"/>
-        <w:gridCol w:w="1878"/>
+        <w:gridCol w:w="2177"/>
+        <w:gridCol w:w="2774"/>
+        <w:gridCol w:w="3754"/>
+        <w:gridCol w:w="2788"/>
+        <w:gridCol w:w="1871"/>
       </w:tblGrid>
       <w:tr>
         <w:tc>
@@ -2666,6 +2642,44 @@
                 <w:szCs w:val="24"/>
               </w:rPr>
             </w:pPr>
+            <w:r>
+              <w:rPr>
+                <w:rFonts w:ascii="Segoe UI" w:hAnsi="Segoe UI" w:cs="Segoe UI"/>
+                <w:color w:val="657B83"/>
+                <w:sz w:val="21"/>
+                <w:szCs w:val="21"/>
+              </w:rPr>
+              <w:t>Product-Service Systems (P</w:t>
+            </w:r>
+            <w:bookmarkStart w:id="0" w:name="_GoBack"/>
+            <w:bookmarkEnd w:id="0"/>
+            <w:r>
+              <w:rPr>
+                <w:rFonts w:ascii="Segoe UI" w:hAnsi="Segoe UI" w:cs="Segoe UI"/>
+                <w:color w:val="657B83"/>
+                <w:sz w:val="21"/>
+                <w:szCs w:val="21"/>
+              </w:rPr>
+              <w:t>SS)</w:t>
+            </w:r>
+            <w:r>
+              <w:rPr>
+                <w:rFonts w:ascii="Segoe UI" w:hAnsi="Segoe UI" w:cs="Segoe UI" w:hint="eastAsia"/>
+                <w:color w:val="657B83"/>
+                <w:sz w:val="21"/>
+                <w:szCs w:val="21"/>
+              </w:rPr>
+              <w:br/>
+            </w:r>
+            <w:r>
+              <w:rPr>
+                <w:rFonts w:ascii="Segoe UI" w:hAnsi="Segoe UI" w:cs="Segoe UI" w:hint="eastAsia"/>
+                <w:color w:val="657B83"/>
+                <w:sz w:val="21"/>
+                <w:szCs w:val="21"/>
+              </w:rPr>
+              <w:t>產品服務化</w:t>
+            </w:r>
           </w:p>
         </w:tc>
         <w:tc>
@@ -2746,6 +2760,126 @@
           <w:tcPr>
             <w:tcW w:w="2122" w:type="dxa"/>
           </w:tcPr>
+          <w:tbl>
+            <w:tblPr>
+              <w:tblW w:w="0" w:type="auto"/>
+              <w:tblCellMar>
+                <w:top w:w="15" w:type="dxa"/>
+                <w:left w:w="15" w:type="dxa"/>
+                <w:bottom w:w="15" w:type="dxa"/>
+                <w:right w:w="15" w:type="dxa"/>
+              </w:tblCellMar>
+              <w:tblLook w:val="04A0" w:firstRow="1" w:lastRow="0" w:firstColumn="1" w:lastColumn="0" w:noHBand="0" w:noVBand="1"/>
+            </w:tblPr>
+            <w:tblGrid>
+              <w:gridCol w:w="1655"/>
+              <w:gridCol w:w="306"/>
+            </w:tblGrid>
+            <w:tr>
+              <w:tc>
+                <w:tcPr>
+                  <w:tcW w:w="0" w:type="auto"/>
+                  <w:tcMar>
+                    <w:top w:w="75" w:type="dxa"/>
+                    <w:left w:w="150" w:type="dxa"/>
+                    <w:bottom w:w="75" w:type="dxa"/>
+                    <w:right w:w="150" w:type="dxa"/>
+                  </w:tcMar>
+                  <w:vAlign w:val="center"/>
+                  <w:hideMark/>
+                </w:tcPr>
+                <w:p>
+                  <w:pPr>
+                    <w:widowControl/>
+                    <w:spacing w:after="168"/>
+                    <w:rPr>
+                      <w:rFonts w:ascii="Segoe UI" w:eastAsia="新細明體" w:hAnsi="Segoe UI" w:cs="Segoe UI"/>
+                      <w:color w:val="657B83"/>
+                      <w:kern w:val="0"/>
+                      <w:sz w:val="21"/>
+                      <w:szCs w:val="21"/>
+                    </w:rPr>
+                  </w:pPr>
+                  <w:r>
+                    <w:rPr>
+                      <w:rFonts w:ascii="Segoe UI" w:eastAsia="新細明體" w:hAnsi="Segoe UI" w:cs="Segoe UI"/>
+                      <w:color w:val="657B83"/>
+                      <w:kern w:val="0"/>
+                      <w:sz w:val="21"/>
+                      <w:szCs w:val="21"/>
+                    </w:rPr>
+                    <w:t>Organizational</w:t>
+                  </w:r>
+                  <w:r>
+                    <w:rPr>
+                      <w:rFonts w:ascii="Segoe UI" w:eastAsia="新細明體" w:hAnsi="Segoe UI" w:cs="Segoe UI" w:hint="eastAsia"/>
+                      <w:color w:val="657B83"/>
+                      <w:kern w:val="0"/>
+                      <w:sz w:val="21"/>
+                      <w:szCs w:val="21"/>
+                    </w:rPr>
+                    <w:t xml:space="preserve"> </w:t>
+                  </w:r>
+                  <w:r>
+                    <w:rPr>
+                      <w:rFonts w:ascii="Segoe UI" w:eastAsia="新細明體" w:hAnsi="Segoe UI" w:cs="Segoe UI"/>
+                      <w:color w:val="657B83"/>
+                      <w:kern w:val="0"/>
+                      <w:sz w:val="21"/>
+                      <w:szCs w:val="21"/>
+                    </w:rPr>
+                    <w:t>buying</w:t>
+                  </w:r>
+                  <w:r>
+                    <w:rPr>
+                      <w:rFonts w:ascii="Segoe UI" w:eastAsia="新細明體" w:hAnsi="Segoe UI" w:cs="Segoe UI" w:hint="eastAsia"/>
+                      <w:color w:val="657B83"/>
+                      <w:kern w:val="0"/>
+                      <w:sz w:val="21"/>
+                      <w:szCs w:val="21"/>
+                    </w:rPr>
+                    <w:t xml:space="preserve"> </w:t>
+                  </w:r>
+                  <w:r>
+                    <w:rPr>
+                      <w:rFonts w:ascii="Segoe UI" w:eastAsia="新細明體" w:hAnsi="Segoe UI" w:cs="Segoe UI"/>
+                      <w:color w:val="657B83"/>
+                      <w:kern w:val="0"/>
+                      <w:sz w:val="21"/>
+                      <w:szCs w:val="21"/>
+                    </w:rPr>
+                    <w:t>behavior</w:t>
+                  </w:r>
+                </w:p>
+              </w:tc>
+              <w:tc>
+                <w:tcPr>
+                  <w:tcW w:w="0" w:type="auto"/>
+                  <w:tcMar>
+                    <w:top w:w="75" w:type="dxa"/>
+                    <w:left w:w="150" w:type="dxa"/>
+                    <w:bottom w:w="75" w:type="dxa"/>
+                    <w:right w:w="150" w:type="dxa"/>
+                  </w:tcMar>
+                  <w:vAlign w:val="center"/>
+                  <w:hideMark/>
+                </w:tcPr>
+                <w:p>
+                  <w:pPr>
+                    <w:widowControl/>
+                    <w:spacing w:after="168"/>
+                    <w:rPr>
+                      <w:rFonts w:ascii="Segoe UI" w:eastAsia="新細明體" w:hAnsi="Segoe UI" w:cs="Segoe UI"/>
+                      <w:color w:val="657B83"/>
+                      <w:kern w:val="0"/>
+                      <w:sz w:val="21"/>
+                      <w:szCs w:val="21"/>
+                    </w:rPr>
+                  </w:pPr>
+                </w:p>
+              </w:tc>
+            </w:tr>
+          </w:tbl>
           <w:p>
             <w:pPr>
               <w:widowControl/>
@@ -4010,7 +4144,7 @@
               </wp:anchor>
             </w:drawing>
           </mc:Choice>
-          <mc:Fallback xmlns:cx="http://schemas.microsoft.com/office/drawing/2014/chartex" xmlns:cx1="http://schemas.microsoft.com/office/drawing/2015/9/8/chartex" xmlns:cx2="http://schemas.microsoft.com/office/drawing/2015/10/21/chartex" xmlns:cx3="http://schemas.microsoft.com/office/drawing/2016/5/9/chartex" xmlns:cx4="http://schemas.microsoft.com/office/drawing/2016/5/10/chartex" xmlns:cx5="http://schemas.microsoft.com/office/drawing/2016/5/11/chartex" xmlns:cx6="http://schemas.microsoft.com/office/drawing/2016/5/12/chartex" xmlns:cx7="http://schemas.microsoft.com/office/drawing/2016/5/13/chartex" xmlns:cx8="http://schemas.microsoft.com/office/drawing/2016/5/14/chartex" xmlns:aink="http://schemas.microsoft.com/office/drawing/2016/ink" xmlns:am3d="http://schemas.microsoft.com/office/drawing/2017/model3d" xmlns:w15="http://schemas.microsoft.com/office/word/2012/wordml" xmlns:w16cex="http://schemas.microsoft.com/office/word/2018/wordml/cex" xmlns:w16cid="http://schemas.microsoft.com/office/word/2016/wordml/cid" xmlns:w16="http://schemas.microsoft.com/office/word/2018/wordml" xmlns:w16sdtdh="http://schemas.microsoft.com/office/word/2020/wordml/sdtdatahash" xmlns:w16se="http://schemas.microsoft.com/office/word/2015/wordml/symex">
+          <mc:Fallback xmlns:w16se="http://schemas.microsoft.com/office/word/2015/wordml/symex" xmlns:w16sdtdh="http://schemas.microsoft.com/office/word/2020/wordml/sdtdatahash" xmlns:w16="http://schemas.microsoft.com/office/word/2018/wordml" xmlns:w16cid="http://schemas.microsoft.com/office/word/2016/wordml/cid" xmlns:w16cex="http://schemas.microsoft.com/office/word/2018/wordml/cex" xmlns:w15="http://schemas.microsoft.com/office/word/2012/wordml" xmlns:am3d="http://schemas.microsoft.com/office/drawing/2017/model3d" xmlns:aink="http://schemas.microsoft.com/office/drawing/2016/ink" xmlns:cx8="http://schemas.microsoft.com/office/drawing/2016/5/14/chartex" xmlns:cx7="http://schemas.microsoft.com/office/drawing/2016/5/13/chartex" xmlns:cx6="http://schemas.microsoft.com/office/drawing/2016/5/12/chartex" xmlns:cx5="http://schemas.microsoft.com/office/drawing/2016/5/11/chartex" xmlns:cx4="http://schemas.microsoft.com/office/drawing/2016/5/10/chartex" xmlns:cx3="http://schemas.microsoft.com/office/drawing/2016/5/9/chartex" xmlns:cx2="http://schemas.microsoft.com/office/drawing/2015/10/21/chartex" xmlns:cx1="http://schemas.microsoft.com/office/drawing/2015/9/8/chartex" xmlns:cx="http://schemas.microsoft.com/office/drawing/2014/chartex">
             <w:pict>
               <v:shape w14:anchorId="405F3E5F" id="直線單箭頭接點 13" o:spid="_x0000_s1026" type="#_x0000_t32" style="position:absolute;margin-left:295.9pt;margin-top:15.75pt;width:0;height:27.1pt;flip:y;z-index:251695104;visibility:visible;mso-wrap-style:square;mso-wrap-distance-left:9pt;mso-wrap-distance-top:0;mso-wrap-distance-right:9pt;mso-wrap-distance-bottom:0;mso-position-horizontal:absolute;mso-position-horizontal-relative:text;mso-position-vertical:absolute;mso-position-vertical-relative:text" o:gfxdata="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" strokecolor="black [3213]" strokeweight="2.25pt">
                 <v:stroke endarrow="block" joinstyle="miter"/>
@@ -4370,7 +4504,7 @@
               </wp:anchor>
             </w:drawing>
           </mc:Choice>
-          <mc:Fallback xmlns:cx="http://schemas.microsoft.com/office/drawing/2014/chartex" xmlns:cx1="http://schemas.microsoft.com/office/drawing/2015/9/8/chartex" xmlns:cx2="http://schemas.microsoft.com/office/drawing/2015/10/21/chartex" xmlns:cx3="http://schemas.microsoft.com/office/drawing/2016/5/9/chartex" xmlns:cx4="http://schemas.microsoft.com/office/drawing/2016/5/10/chartex" xmlns:cx5="http://schemas.microsoft.com/office/drawing/2016/5/11/chartex" xmlns:cx6="http://schemas.microsoft.com/office/drawing/2016/5/12/chartex" xmlns:cx7="http://schemas.microsoft.com/office/drawing/2016/5/13/chartex" xmlns:cx8="http://schemas.microsoft.com/office/drawing/2016/5/14/chartex" xmlns:aink="http://schemas.microsoft.com/office/drawing/2016/ink" xmlns:am3d="http://schemas.microsoft.com/office/drawing/2017/model3d" xmlns:w15="http://schemas.microsoft.com/office/word/2012/wordml" xmlns:w16cex="http://schemas.microsoft.com/office/word/2018/wordml/cex" xmlns:w16cid="http://schemas.microsoft.com/office/word/2016/wordml/cid" xmlns:w16="http://schemas.microsoft.com/office/word/2018/wordml" xmlns:w16sdtdh="http://schemas.microsoft.com/office/word/2020/wordml/sdtdatahash" xmlns:w16se="http://schemas.microsoft.com/office/word/2015/wordml/symex">
+          <mc:Fallback xmlns:w16se="http://schemas.microsoft.com/office/word/2015/wordml/symex" xmlns:w16sdtdh="http://schemas.microsoft.com/office/word/2020/wordml/sdtdatahash" xmlns:w16="http://schemas.microsoft.com/office/word/2018/wordml" xmlns:w16cid="http://schemas.microsoft.com/office/word/2016/wordml/cid" xmlns:w16cex="http://schemas.microsoft.com/office/word/2018/wordml/cex" xmlns:w15="http://schemas.microsoft.com/office/word/2012/wordml" xmlns:am3d="http://schemas.microsoft.com/office/drawing/2017/model3d" xmlns:aink="http://schemas.microsoft.com/office/drawing/2016/ink" xmlns:cx8="http://schemas.microsoft.com/office/drawing/2016/5/14/chartex" xmlns:cx7="http://schemas.microsoft.com/office/drawing/2016/5/13/chartex" xmlns:cx6="http://schemas.microsoft.com/office/drawing/2016/5/12/chartex" xmlns:cx5="http://schemas.microsoft.com/office/drawing/2016/5/11/chartex" xmlns:cx4="http://schemas.microsoft.com/office/drawing/2016/5/10/chartex" xmlns:cx3="http://schemas.microsoft.com/office/drawing/2016/5/9/chartex" xmlns:cx2="http://schemas.microsoft.com/office/drawing/2015/10/21/chartex" xmlns:cx1="http://schemas.microsoft.com/office/drawing/2015/9/8/chartex" xmlns:cx="http://schemas.microsoft.com/office/drawing/2014/chartex">
             <w:pict>
               <v:shape w14:anchorId="1FE79BF4" id="直線單箭頭接點 2" o:spid="_x0000_s1026" type="#_x0000_t32" style="position:absolute;margin-left:262.15pt;margin-top:15.35pt;width:71.1pt;height:.4pt;z-index:251694080;visibility:visible;mso-wrap-style:square;mso-wrap-distance-left:9pt;mso-wrap-distance-top:0;mso-wrap-distance-right:9pt;mso-wrap-distance-bottom:0;mso-position-horizontal:absolute;mso-position-horizontal-relative:text;mso-position-vertical:absolute;mso-position-vertical-relative:text" o:gfxdata="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" strokecolor="black [3200]" strokeweight="1.5pt">
                 <v:stroke endarrow="block" joinstyle="miter"/>
@@ -4815,8 +4949,6 @@
               </w:rPr>
               <w:t xml:space="preserve">  </w:t>
             </w:r>
-            <w:bookmarkStart w:id="0" w:name="_GoBack"/>
-            <w:bookmarkEnd w:id="0"/>
           </w:p>
         </w:tc>
         <w:tc>
@@ -7123,7 +7255,7 @@
   <a:extraClrSchemeLst/>
   <a:extLst>
     <a:ext uri="{05A4C25C-085E-4340-85A3-A5531E510DB2}">
-      <thm15:themeFamily xmlns="" xmlns:thm15="http://schemas.microsoft.com/office/thememl/2012/main" name="Office Theme" id="{62F939B6-93AF-4DB8-9C6B-D6C7DFDC589F}" vid="{4A3C46E8-61CC-4603-A589-7422A47A8E4A}"/>
+      <thm15:themeFamily xmlns:thm15="http://schemas.microsoft.com/office/thememl/2012/main" xmlns="" name="Office Theme" id="{62F939B6-93AF-4DB8-9C6B-D6C7DFDC589F}" vid="{4A3C46E8-61CC-4603-A589-7422A47A8E4A}"/>
     </a:ext>
   </a:extLst>
 </a:theme>

</xml_diff>